<commit_message>
Guarda documentos en Google Drive
archivos modificados: páginas Logistika/Plangintza, servicios Google Auth/Drive, diálogos compartidos, modelos Drive/documento, plantillas y artefactos publicados

cambio realizado: reemplaza descarga directa por selección de carpeta Drive, subida vía Drive API y fallback de descarga si Drive falla

posibles riesgos: requiere consentimiento OAuth Drive y permisos correctos del usuario sobre la carpeta destino
</commit_message>
<xml_diff>
--- a/Infrastructure/Documents/Templates/Plangintza.docx
+++ b/Infrastructure/Documents/Templates/Plangintza.docx
@@ -17,7 +17,7 @@
       <w:tblPr>
         <w:tblStyle w:val="a"/>
         <w:tblpPr w:leftFromText="180" w:rightFromText="180" w:topFromText="180" w:bottomFromText="180" w:vertAnchor="text"/>
-        <w:tblW w:w="13299" w:type="dxa"/>
+        <w:tblW w:w="10500" w:type="dxa"/>
         <w:tblInd w:w="0" w:type="dxa"/>
         <w:tblBorders>
           <w:top w:val="single" w:sz="8" w:space="0" w:color="000000"/>
@@ -29,12 +29,13 @@
         </w:tblBorders>
         <w:tblLayout w:type="fixed"/>
         <w:tblLook w:val="0600" w:firstRow="0" w:lastRow="0" w:firstColumn="0" w:lastColumn="0" w:noHBand="1" w:noVBand="1"/>
+        <w:jc w:val="center"/>
       </w:tblPr>
       <w:tblGrid>
-        <w:gridCol w:w="2612"/>
-        <w:gridCol w:w="3531"/>
-        <w:gridCol w:w="3578"/>
-        <w:gridCol w:w="3578"/>
+        <w:gridCol w:w="2100"/>
+        <w:gridCol w:w="2800"/>
+        <w:gridCol w:w="3300"/>
+        <w:gridCol w:w="2300"/>
       </w:tblGrid>
       <w:tr>
         <w:trPr>
@@ -42,7 +43,7 @@
         </w:trPr>
         <w:tc>
           <w:tcPr>
-            <w:tcW w:w="2058" w:type="dxa"/>
+            <w:tcW w:w="2100" w:type="dxa"/>
             <w:tcBorders>
               <w:top w:val="single" w:sz="9" w:space="0" w:color="CCCCCC"/>
               <w:left w:val="single" w:sz="9" w:space="0" w:color="CCCCCC"/>
@@ -60,13 +61,16 @@
           </w:tcPr>
           <w:p>
             <w:r>
+              <w:rPr>
+                <w:sz w:val="16"/>
+              </w:rPr>
               <w:t>Datak</w:t>
             </w:r>
           </w:p>
         </w:tc>
         <w:tc>
           <w:tcPr>
-            <w:tcW w:w="2782" w:type="dxa"/>
+            <w:tcW w:w="2800" w:type="dxa"/>
             <w:tcBorders>
               <w:top w:val="single" w:sz="8" w:space="0" w:color="CCCCCC"/>
               <w:left w:val="single" w:sz="9" w:space="0" w:color="CCCCCC"/>
@@ -82,11 +86,18 @@
             </w:tcMar>
             <w:vAlign w:val="center"/>
           </w:tcPr>
-          <w:p/>
-        </w:tc>
-        <w:tc>
-          <w:tcPr>
-            <w:tcW w:w="2819" w:type="dxa"/>
+          <w:p>
+            <w:r>
+              <w:rPr>
+                <w:sz w:val="16"/>
+              </w:rPr>
+              <w:t>{{DATAK}}</w:t>
+            </w:r>
+          </w:p>
+        </w:tc>
+        <w:tc>
+          <w:tcPr>
+            <w:tcW w:w="3300" w:type="dxa"/>
             <w:tcBorders>
               <w:top w:val="single" w:sz="9" w:space="0" w:color="CCCCCC"/>
               <w:left w:val="single" w:sz="9" w:space="0" w:color="CCCCCC"/>
@@ -105,6 +116,9 @@
           <w:p>
             <w:proofErr w:type="spellStart"/>
             <w:r>
+              <w:rPr>
+                <w:sz w:val="16"/>
+              </w:rPr>
               <w:t>Ibilbidea</w:t>
             </w:r>
             <w:proofErr w:type="spellEnd"/>
@@ -112,7 +126,7 @@
         </w:tc>
         <w:tc>
           <w:tcPr>
-            <w:tcW w:w="2819" w:type="dxa"/>
+            <w:tcW w:w="2300" w:type="dxa"/>
             <w:tcBorders>
               <w:top w:val="single" w:sz="8" w:space="0" w:color="CCCCCC"/>
               <w:left w:val="single" w:sz="9" w:space="0" w:color="CCCCCC"/>
@@ -128,7 +142,14 @@
             </w:tcMar>
             <w:vAlign w:val="center"/>
           </w:tcPr>
-          <w:p/>
+          <w:p>
+            <w:r>
+              <w:rPr>
+                <w:sz w:val="16"/>
+              </w:rPr>
+              <w:t>{{IBILBIDEA}}</w:t>
+            </w:r>
+          </w:p>
         </w:tc>
       </w:tr>
       <w:tr>
@@ -137,7 +158,7 @@
         </w:trPr>
         <w:tc>
           <w:tcPr>
-            <w:tcW w:w="2058" w:type="dxa"/>
+            <w:tcW w:w="2100" w:type="dxa"/>
             <w:tcBorders>
               <w:top w:val="single" w:sz="9" w:space="0" w:color="CCCCCC"/>
               <w:left w:val="single" w:sz="9" w:space="0" w:color="CCCCCC"/>
@@ -156,14 +177,23 @@
           <w:p>
             <w:proofErr w:type="spellStart"/>
             <w:r>
+              <w:rPr>
+                <w:sz w:val="16"/>
+              </w:rPr>
               <w:t>Irakasle</w:t>
             </w:r>
             <w:proofErr w:type="spellEnd"/>
             <w:r>
+              <w:rPr>
+                <w:sz w:val="16"/>
+              </w:rPr>
               <w:t xml:space="preserve"> </w:t>
             </w:r>
             <w:proofErr w:type="spellStart"/>
             <w:r>
+              <w:rPr>
+                <w:sz w:val="16"/>
+              </w:rPr>
               <w:t>kopurua</w:t>
             </w:r>
             <w:proofErr w:type="spellEnd"/>
@@ -171,7 +201,7 @@
         </w:tc>
         <w:tc>
           <w:tcPr>
-            <w:tcW w:w="2782" w:type="dxa"/>
+            <w:tcW w:w="2800" w:type="dxa"/>
             <w:tcBorders>
               <w:top w:val="single" w:sz="8" w:space="0" w:color="CCCCCC"/>
               <w:left w:val="single" w:sz="9" w:space="0" w:color="CCCCCC"/>
@@ -187,11 +217,18 @@
             </w:tcMar>
             <w:vAlign w:val="center"/>
           </w:tcPr>
-          <w:p/>
-        </w:tc>
-        <w:tc>
-          <w:tcPr>
-            <w:tcW w:w="2819" w:type="dxa"/>
+          <w:p>
+            <w:r>
+              <w:rPr>
+                <w:sz w:val="16"/>
+              </w:rPr>
+              <w:t>{{IRAKASLEAK}}</w:t>
+            </w:r>
+          </w:p>
+        </w:tc>
+        <w:tc>
+          <w:tcPr>
+            <w:tcW w:w="3300" w:type="dxa"/>
             <w:tcBorders>
               <w:top w:val="single" w:sz="9" w:space="0" w:color="CCCCCC"/>
               <w:left w:val="single" w:sz="9" w:space="0" w:color="CCCCCC"/>
@@ -210,14 +247,23 @@
           <w:p>
             <w:proofErr w:type="spellStart"/>
             <w:r>
+              <w:rPr>
+                <w:sz w:val="16"/>
+              </w:rPr>
               <w:t>Begirale</w:t>
             </w:r>
             <w:proofErr w:type="spellEnd"/>
             <w:r>
+              <w:rPr>
+                <w:sz w:val="16"/>
+              </w:rPr>
               <w:t xml:space="preserve"> </w:t>
             </w:r>
             <w:proofErr w:type="spellStart"/>
             <w:r>
+              <w:rPr>
+                <w:sz w:val="16"/>
+              </w:rPr>
               <w:t>kopurua</w:t>
             </w:r>
             <w:proofErr w:type="spellEnd"/>
@@ -225,7 +271,7 @@
         </w:tc>
         <w:tc>
           <w:tcPr>
-            <w:tcW w:w="2819" w:type="dxa"/>
+            <w:tcW w:w="2300" w:type="dxa"/>
             <w:tcBorders>
               <w:top w:val="single" w:sz="8" w:space="0" w:color="CCCCCC"/>
               <w:left w:val="single" w:sz="9" w:space="0" w:color="CCCCCC"/>
@@ -241,7 +287,14 @@
             </w:tcMar>
             <w:vAlign w:val="center"/>
           </w:tcPr>
-          <w:p/>
+          <w:p>
+            <w:r>
+              <w:rPr>
+                <w:sz w:val="16"/>
+              </w:rPr>
+              <w:t>{{BEGIRALEAK}}</w:t>
+            </w:r>
+          </w:p>
         </w:tc>
       </w:tr>
       <w:tr>
@@ -250,7 +303,7 @@
         </w:trPr>
         <w:tc>
           <w:tcPr>
-            <w:tcW w:w="2058" w:type="dxa"/>
+            <w:tcW w:w="2100" w:type="dxa"/>
             <w:tcBorders>
               <w:top w:val="single" w:sz="9" w:space="0" w:color="CCCCCC"/>
               <w:left w:val="single" w:sz="9" w:space="0" w:color="CCCCCC"/>
@@ -269,14 +322,23 @@
           <w:p>
             <w:proofErr w:type="spellStart"/>
             <w:r>
+              <w:rPr>
+                <w:sz w:val="16"/>
+              </w:rPr>
               <w:t>Ikasle</w:t>
             </w:r>
             <w:proofErr w:type="spellEnd"/>
             <w:r>
+              <w:rPr>
+                <w:sz w:val="16"/>
+              </w:rPr>
               <w:t xml:space="preserve"> </w:t>
             </w:r>
             <w:proofErr w:type="spellStart"/>
             <w:r>
+              <w:rPr>
+                <w:sz w:val="16"/>
+              </w:rPr>
               <w:t>kopurua</w:t>
             </w:r>
             <w:proofErr w:type="spellEnd"/>
@@ -284,7 +346,7 @@
         </w:tc>
         <w:tc>
           <w:tcPr>
-            <w:tcW w:w="2782" w:type="dxa"/>
+            <w:tcW w:w="2800" w:type="dxa"/>
             <w:tcBorders>
               <w:top w:val="single" w:sz="8" w:space="0" w:color="CCCCCC"/>
               <w:left w:val="single" w:sz="9" w:space="0" w:color="CCCCCC"/>
@@ -300,11 +362,18 @@
             </w:tcMar>
             <w:vAlign w:val="center"/>
           </w:tcPr>
-          <w:p/>
-        </w:tc>
-        <w:tc>
-          <w:tcPr>
-            <w:tcW w:w="2819" w:type="dxa"/>
+          <w:p>
+            <w:r>
+              <w:rPr>
+                <w:sz w:val="16"/>
+              </w:rPr>
+              <w:t>{{IKASLEAK}}</w:t>
+            </w:r>
+          </w:p>
+        </w:tc>
+        <w:tc>
+          <w:tcPr>
+            <w:tcW w:w="3300" w:type="dxa"/>
             <w:tcBorders>
               <w:top w:val="single" w:sz="9" w:space="0" w:color="CCCCCC"/>
               <w:left w:val="single" w:sz="9" w:space="0" w:color="CCCCCC"/>
@@ -323,22 +392,37 @@
           <w:p>
             <w:proofErr w:type="spellStart"/>
             <w:r>
+              <w:rPr>
+                <w:sz w:val="16"/>
+              </w:rPr>
               <w:t>Autobus</w:t>
             </w:r>
             <w:proofErr w:type="spellEnd"/>
             <w:r>
+              <w:rPr>
+                <w:sz w:val="16"/>
+              </w:rPr>
               <w:t xml:space="preserve"> </w:t>
             </w:r>
             <w:proofErr w:type="spellStart"/>
             <w:r>
+              <w:rPr>
+                <w:sz w:val="16"/>
+              </w:rPr>
               <w:t>gidari</w:t>
             </w:r>
             <w:proofErr w:type="spellEnd"/>
             <w:r>
+              <w:rPr>
+                <w:sz w:val="16"/>
+              </w:rPr>
               <w:t xml:space="preserve"> </w:t>
             </w:r>
             <w:proofErr w:type="spellStart"/>
             <w:r>
+              <w:rPr>
+                <w:sz w:val="16"/>
+              </w:rPr>
               <w:t>kopurua</w:t>
             </w:r>
             <w:proofErr w:type="spellEnd"/>
@@ -346,7 +430,7 @@
         </w:tc>
         <w:tc>
           <w:tcPr>
-            <w:tcW w:w="2819" w:type="dxa"/>
+            <w:tcW w:w="2300" w:type="dxa"/>
             <w:tcBorders>
               <w:top w:val="single" w:sz="8" w:space="0" w:color="CCCCCC"/>
               <w:left w:val="single" w:sz="9" w:space="0" w:color="CCCCCC"/>
@@ -362,7 +446,14 @@
             </w:tcMar>
             <w:vAlign w:val="center"/>
           </w:tcPr>
-          <w:p/>
+          <w:p>
+            <w:r>
+              <w:rPr>
+                <w:sz w:val="16"/>
+              </w:rPr>
+              <w:t>{{GIDARIAK}}</w:t>
+            </w:r>
+          </w:p>
         </w:tc>
       </w:tr>
     </w:tbl>
@@ -2132,7 +2223,6 @@
           <w:p>
             <w:proofErr w:type="spellStart"/>
             <w:r>
-              <w:lastRenderedPageBreak/>
               <w:t>Goiza</w:t>
             </w:r>
             <w:proofErr w:type="spellEnd"/>
@@ -3508,7 +3598,6 @@
           </w:tcPr>
           <w:p>
             <w:r>
-              <w:lastRenderedPageBreak/>
               <w:t>{{EGUNA_ORDUA}}</w:t>
             </w:r>
           </w:p>
@@ -4417,7 +4506,6 @@
               </w:numPr>
             </w:pPr>
             <w:r>
-              <w:lastRenderedPageBreak/>
               <w:t>EGUNA: {{EGUNA_IZENBURUA}}</w:t>
             </w:r>
           </w:p>
@@ -5307,7 +5395,6 @@
           </w:tcPr>
           <w:p>
             <w:r>
-              <w:lastRenderedPageBreak/>
               <w:t>{{EGUNA_ORDUA}}</w:t>
             </w:r>
           </w:p>
@@ -6215,7 +6302,6 @@
               </w:numPr>
             </w:pPr>
             <w:r>
-              <w:lastRenderedPageBreak/>
               <w:t>EGUNA: {{EGUNA_IZENBURUA}}</w:t>
             </w:r>
           </w:p>
@@ -7070,7 +7156,6 @@
               <w:t>{{EGUNA_ORD</w:t>
             </w:r>
             <w:r>
-              <w:lastRenderedPageBreak/>
               <w:t>UA}}</w:t>
             </w:r>
           </w:p>
@@ -7094,7 +7179,6 @@
           </w:tcPr>
           <w:p>
             <w:r>
-              <w:lastRenderedPageBreak/>
               <w:t>{{EGUNA_DESKRIBAPENA}}</w:t>
             </w:r>
           </w:p>
@@ -7994,7 +8078,6 @@
           </w:tcPr>
           <w:p>
             <w:r>
-              <w:lastRenderedPageBreak/>
               <w:t>{{EGUNA_ORDUA}}</w:t>
             </w:r>
           </w:p>
@@ -8870,7 +8953,6 @@
               <w:t>{{EGUNA_ORD</w:t>
             </w:r>
             <w:r>
-              <w:lastRenderedPageBreak/>
               <w:t>UA}}</w:t>
             </w:r>
           </w:p>
@@ -8894,7 +8976,6 @@
           </w:tcPr>
           <w:p>
             <w:r>
-              <w:lastRenderedPageBreak/>
               <w:t>{{EGUNA_DESKRIBAPENA}}</w:t>
             </w:r>
           </w:p>
@@ -9792,7 +9873,6 @@
           </w:tcPr>
           <w:p>
             <w:r>
-              <w:lastRenderedPageBreak/>
               <w:t>{{EGUNA_ORDUA}}</w:t>
             </w:r>
           </w:p>
@@ -10668,7 +10748,6 @@
               <w:t>{{EGUNA_ORD</w:t>
             </w:r>
             <w:r>
-              <w:lastRenderedPageBreak/>
               <w:t>UA}}</w:t>
             </w:r>
           </w:p>
@@ -10692,7 +10771,6 @@
           </w:tcPr>
           <w:p>
             <w:r>
-              <w:lastRenderedPageBreak/>
               <w:t>{{EGUNA_DESKRIBAPENA}}</w:t>
             </w:r>
           </w:p>
@@ -11553,7 +11631,6 @@
               <w:t>{{EGUNA_ORD</w:t>
             </w:r>
             <w:r>
-              <w:lastRenderedPageBreak/>
               <w:t>UA}}</w:t>
             </w:r>
           </w:p>
@@ -11577,7 +11654,6 @@
           </w:tcPr>
           <w:p>
             <w:r>
-              <w:lastRenderedPageBreak/>
               <w:t>{{EGUNA_DESKRIBAPENA}}</w:t>
             </w:r>
           </w:p>
@@ -12475,7 +12551,6 @@
           </w:tcPr>
           <w:p>
             <w:r>
-              <w:lastRenderedPageBreak/>
               <w:t>{{EGUNA_ORDUA}}</w:t>
             </w:r>
           </w:p>
@@ -13351,7 +13426,6 @@
               <w:t>{{EGUNA_ORD</w:t>
             </w:r>
             <w:r>
-              <w:lastRenderedPageBreak/>
               <w:t>UA}}</w:t>
             </w:r>
           </w:p>
@@ -13375,7 +13449,6 @@
           </w:tcPr>
           <w:p>
             <w:r>
-              <w:lastRenderedPageBreak/>
               <w:t>{{EGUNA_DESKRIBAPENA}}</w:t>
             </w:r>
           </w:p>
@@ -13753,79 +13826,41 @@
 <file path=word/footer1.xml><?xml version="1.0" encoding="utf-8"?>
 <w:ftr xmlns:wpc="http://schemas.microsoft.com/office/word/2010/wordprocessingCanvas" xmlns:cx="http://schemas.microsoft.com/office/drawing/2014/chartex" xmlns:cx1="http://schemas.microsoft.com/office/drawing/2015/9/8/chartex" xmlns:cx2="http://schemas.microsoft.com/office/drawing/2015/10/21/chartex" xmlns:cx3="http://schemas.microsoft.com/office/drawing/2016/5/9/chartex" xmlns:cx4="http://schemas.microsoft.com/office/drawing/2016/5/10/chartex" xmlns:cx5="http://schemas.microsoft.com/office/drawing/2016/5/11/chartex" xmlns:cx6="http://schemas.microsoft.com/office/drawing/2016/5/12/chartex" xmlns:cx7="http://schemas.microsoft.com/office/drawing/2016/5/13/chartex" xmlns:cx8="http://schemas.microsoft.com/office/drawing/2016/5/14/chartex" xmlns:mc="http://schemas.openxmlformats.org/markup-compatibility/2006" xmlns:aink="http://schemas.microsoft.com/office/drawing/2016/ink" xmlns:am3d="http://schemas.microsoft.com/office/drawing/2017/model3d" xmlns:o="urn:schemas-microsoft-com:office:office" xmlns:oel="http://schemas.microsoft.com/office/2019/extlst" xmlns:r="http://schemas.openxmlformats.org/officeDocument/2006/relationships" xmlns:m="http://schemas.openxmlformats.org/officeDocument/2006/math" xmlns:v="urn:schemas-microsoft-com:vml" xmlns:wp14="http://schemas.microsoft.com/office/word/2010/wordprocessingDrawing" xmlns:wp="http://schemas.openxmlformats.org/drawingml/2006/wordprocessingDrawing" xmlns:w10="urn:schemas-microsoft-com:office:word" xmlns:w="http://schemas.openxmlformats.org/wordprocessingml/2006/main" xmlns:w14="http://schemas.microsoft.com/office/word/2010/wordml" xmlns:w15="http://schemas.microsoft.com/office/word/2012/wordml" xmlns:w16cex="http://schemas.microsoft.com/office/word/2018/wordml/cex" xmlns:w16cid="http://schemas.microsoft.com/office/word/2016/wordml/cid" xmlns:w16="http://schemas.microsoft.com/office/word/2018/wordml" xmlns:w16du="http://schemas.microsoft.com/office/word/2023/wordml/word16du" xmlns:w16sdtdh="http://schemas.microsoft.com/office/word/2020/wordml/sdtdatahash" xmlns:w16sdtfl="http://schemas.microsoft.com/office/word/2024/wordml/sdtformatlock" xmlns:w16se="http://schemas.microsoft.com/office/word/2015/wordml/symex" xmlns:wpg="http://schemas.microsoft.com/office/word/2010/wordprocessingGroup" xmlns:wpi="http://schemas.microsoft.com/office/word/2010/wordprocessingInk" xmlns:wne="http://schemas.microsoft.com/office/word/2006/wordml" xmlns:wps="http://schemas.microsoft.com/office/word/2010/wordprocessingShape" mc:Ignorable="w14 w15 w16se w16cid w16 w16cex w16sdtdh w16sdtfl w16du wp14">
   <w:p>
-    <w:r>
-      <w:t xml:space="preserve"> </w:t>
-    </w:r>
+    <w:pPr>
+      <w:jc w:val="center"/>
+    </w:pPr>
     <w:r>
       <w:fldChar w:fldCharType="begin"/>
     </w:r>
     <w:r>
-      <w:instrText>PAGE</w:instrText>
+      <w:instrText xml:space="preserve"> PAGE </w:instrText>
     </w:r>
     <w:r>
       <w:fldChar w:fldCharType="separate"/>
     </w:r>
     <w:r>
-      <w:rPr>
-        <w:noProof/>
-      </w:rPr>
       <w:t>1</w:t>
     </w:r>
     <w:r>
       <w:fldChar w:fldCharType="end"/>
     </w:r>
     <w:r>
-      <w:t>/3</w:t>
+      <w:t>/</w:t>
     </w:r>
     <w:r>
-      <w:rPr>
-        <w:noProof/>
-      </w:rPr>
-      <w:drawing>
-        <wp:anchor distT="114300" distB="114300" distL="114300" distR="114300" simplePos="0" relativeHeight="251658240" behindDoc="0" locked="0" layoutInCell="1" hidden="0" allowOverlap="1" wp14:anchorId="1E1268B1" wp14:editId="434722AC">
-          <wp:simplePos x="0" y="0"/>
-          <wp:positionH relativeFrom="column">
-            <wp:posOffset>1</wp:posOffset>
-          </wp:positionH>
-          <wp:positionV relativeFrom="paragraph">
-            <wp:posOffset>-114299</wp:posOffset>
-          </wp:positionV>
-          <wp:extent cx="1139298" cy="433388"/>
-          <wp:effectExtent l="0" t="0" r="0" b="0"/>
-          <wp:wrapSquare wrapText="bothSides" distT="114300" distB="114300" distL="114300" distR="114300"/>
-          <wp:docPr id="1" name="image1.png"/>
-          <wp:cNvGraphicFramePr/>
-          <a:graphic xmlns:a="http://schemas.openxmlformats.org/drawingml/2006/main">
-            <a:graphicData uri="http://schemas.openxmlformats.org/drawingml/2006/picture">
-              <pic:pic xmlns:pic="http://schemas.openxmlformats.org/drawingml/2006/picture">
-                <pic:nvPicPr>
-                  <pic:cNvPr id="0" name="image1.png"/>
-                  <pic:cNvPicPr preferRelativeResize="0"/>
-                </pic:nvPicPr>
-                <pic:blipFill>
-                  <a:blip r:embed="rId1">
-                    <a:alphaModFix amt="71000"/>
-                  </a:blip>
-                  <a:srcRect/>
-                  <a:stretch>
-                    <a:fillRect/>
-                  </a:stretch>
-                </pic:blipFill>
-                <pic:spPr>
-                  <a:xfrm>
-                    <a:off x="0" y="0"/>
-                    <a:ext cx="1139298" cy="433388"/>
-                  </a:xfrm>
-                  <a:prstGeom prst="rect">
-                    <a:avLst/>
-                  </a:prstGeom>
-                  <a:ln/>
-                </pic:spPr>
-              </pic:pic>
-            </a:graphicData>
-          </a:graphic>
-        </wp:anchor>
-      </w:drawing>
+      <w:fldChar w:fldCharType="begin"/>
+    </w:r>
+    <w:r>
+      <w:instrText xml:space="preserve"> NUMPAGES </w:instrText>
+    </w:r>
+    <w:r>
+      <w:fldChar w:fldCharType="separate"/>
+    </w:r>
+    <w:r>
+      <w:t>1</w:t>
+    </w:r>
+    <w:r>
+      <w:fldChar w:fldCharType="end"/>
     </w:r>
   </w:p>
   <w:p/>

</xml_diff>

<commit_message>
Actualiza cabecera y polizas de plantillas
</commit_message>
<xml_diff>
--- a/Infrastructure/Documents/Templates/Plangintza.docx
+++ b/Infrastructure/Documents/Templates/Plangintza.docx
@@ -20180,7 +20180,7 @@
 </file>
 
 <file path=word/header1.xml><?xml version="1.0" encoding="utf-8"?>
-<w:hdr xmlns:wpc="http://schemas.microsoft.com/office/word/2010/wordprocessingCanvas" xmlns:cx="http://schemas.microsoft.com/office/drawing/2014/chartex" xmlns:cx1="http://schemas.microsoft.com/office/drawing/2015/9/8/chartex" xmlns:cx2="http://schemas.microsoft.com/office/drawing/2015/10/21/chartex" xmlns:cx3="http://schemas.microsoft.com/office/drawing/2016/5/9/chartex" xmlns:cx4="http://schemas.microsoft.com/office/drawing/2016/5/10/chartex" xmlns:cx5="http://schemas.microsoft.com/office/drawing/2016/5/11/chartex" xmlns:cx6="http://schemas.microsoft.com/office/drawing/2016/5/12/chartex" xmlns:cx7="http://schemas.microsoft.com/office/drawing/2016/5/13/chartex" xmlns:cx8="http://schemas.microsoft.com/office/drawing/2016/5/14/chartex" xmlns:mc="http://schemas.openxmlformats.org/markup-compatibility/2006" xmlns:aink="http://schemas.microsoft.com/office/drawing/2016/ink" xmlns:am3d="http://schemas.microsoft.com/office/drawing/2017/model3d" xmlns:o="urn:schemas-microsoft-com:office:office" xmlns:oel="http://schemas.microsoft.com/office/2019/extlst" xmlns:r="http://schemas.openxmlformats.org/officeDocument/2006/relationships" xmlns:m="http://schemas.openxmlformats.org/officeDocument/2006/math" xmlns:v="urn:schemas-microsoft-com:vml" xmlns:wp14="http://schemas.microsoft.com/office/word/2010/wordprocessingDrawing" xmlns:wp="http://schemas.openxmlformats.org/drawingml/2006/wordprocessingDrawing" xmlns:w10="urn:schemas-microsoft-com:office:word" xmlns:w="http://schemas.openxmlformats.org/wordprocessingml/2006/main" xmlns:w14="http://schemas.microsoft.com/office/word/2010/wordml" xmlns:w15="http://schemas.microsoft.com/office/word/2012/wordml" xmlns:w16cex="http://schemas.microsoft.com/office/word/2018/wordml/cex" xmlns:w16cid="http://schemas.microsoft.com/office/word/2016/wordml/cid" xmlns:w16="http://schemas.microsoft.com/office/word/2018/wordml" xmlns:w16du="http://schemas.microsoft.com/office/word/2023/wordml/word16du" xmlns:w16sdtdh="http://schemas.microsoft.com/office/word/2020/wordml/sdtdatahash" xmlns:w16sdtfl="http://schemas.microsoft.com/office/word/2024/wordml/sdtformatlock" xmlns:w16se="http://schemas.microsoft.com/office/word/2015/wordml/symex" xmlns:wpg="http://schemas.microsoft.com/office/word/2010/wordprocessingGroup" xmlns:wpi="http://schemas.microsoft.com/office/word/2010/wordprocessingInk" xmlns:wne="http://schemas.microsoft.com/office/word/2006/wordml" xmlns:wps="http://schemas.microsoft.com/office/word/2010/wordprocessingShape" mc:Ignorable="w14 w15 w16se w16cid w16 w16cex w16sdtdh w16sdtfl w16du wp14">
+<w:hdr xmlns:mc="http://schemas.openxmlformats.org/markup-compatibility/2006" xmlns:w="http://schemas.openxmlformats.org/wordprocessingml/2006/main" xmlns:w14="http://schemas.microsoft.com/office/word/2010/wordml" mc:Ignorable="w14 w15 w16se w16cid w16 w16cex w16sdtdh w16sdtfl w16du wp14">
   <w:p/>
   <w:tbl>
     <w:tblPr>
@@ -20243,7 +20243,7 @@
         </w:tcPr>
         <w:p>
           <w:r>
-            <w:t>XXXXXXXX IKAS BIDAIA 2025-2026</w:t>
+            <w:t>{{IKASTETXEA}} IKAS BIDAIA 2025-2026</w:t>
           </w:r>
         </w:p>
       </w:tc>

</xml_diff>